<commit_message>
Archive Zittingslijsten-Schema.docx from rechtzaak: Schema reference, single-status workflow noted
</commit_message>
<xml_diff>
--- a/projects/rechtzaak/docs/Zittingslijsten-Schema.docx
+++ b/projects/rechtzaak/docs/Zittingslijsten-Schema.docx
@@ -87,6 +87,158 @@
         <w:t xml:space="preserve">. Sections below describe the current state after migrations 001–006.</w:t>
       </w:r>
     </w:p>
+    <w:p>
+      <w:pPr>
+        <w:pStyle w:val="BlockText"/>
+      </w:pPr>
+      <w:r>
+        <w:rPr>
+          <w:b/>
+          <w:bCs/>
+        </w:rPr>
+        <w:t xml:space="preserve">Workflow note.</w:t>
+      </w:r>
+      <w:r>
+        <w:t xml:space="preserve"> </w:t>
+      </w:r>
+      <w:r>
+        <w:t xml:space="preserve">The current process has a single straight path: a document moves</w:t>
+      </w:r>
+      <w:r>
+        <w:t xml:space="preserve"> </w:t>
+      </w:r>
+      <w:r>
+        <w:rPr>
+          <w:rStyle w:val="VerbatimChar"/>
+        </w:rPr>
+        <w:t xml:space="preserve">NIEUW → IN_BEHANDELING → KLAAR</w:t>
+      </w:r>
+      <w:r>
+        <w:t xml:space="preserve">. There is no review or approval step. Several columns (</w:t>
+      </w:r>
+      <w:r>
+        <w:rPr>
+          <w:rStyle w:val="VerbatimChar"/>
+        </w:rPr>
+        <w:t xml:space="preserve">rejection_*</w:t>
+      </w:r>
+      <w:r>
+        <w:t xml:space="preserve">,</w:t>
+      </w:r>
+      <w:r>
+        <w:t xml:space="preserve"> </w:t>
+      </w:r>
+      <w:r>
+        <w:rPr>
+          <w:rStyle w:val="VerbatimChar"/>
+        </w:rPr>
+        <w:t xml:space="preserve">reviewed_*</w:t>
+      </w:r>
+      <w:r>
+        <w:t xml:space="preserve">) and several enum values (</w:t>
+      </w:r>
+      <w:r>
+        <w:rPr>
+          <w:rStyle w:val="VerbatimChar"/>
+        </w:rPr>
+        <w:t xml:space="preserve">EERSTE_BEOORDELING</w:t>
+      </w:r>
+      <w:r>
+        <w:t xml:space="preserve">,</w:t>
+      </w:r>
+      <w:r>
+        <w:t xml:space="preserve"> </w:t>
+      </w:r>
+      <w:r>
+        <w:rPr>
+          <w:rStyle w:val="VerbatimChar"/>
+        </w:rPr>
+        <w:t xml:space="preserve">EINDBEOORDELING</w:t>
+      </w:r>
+      <w:r>
+        <w:t xml:space="preserve">,</w:t>
+      </w:r>
+      <w:r>
+        <w:t xml:space="preserve"> </w:t>
+      </w:r>
+      <w:r>
+        <w:rPr>
+          <w:rStyle w:val="VerbatimChar"/>
+        </w:rPr>
+        <w:t xml:space="preserve">AFGEKEURD</w:t>
+      </w:r>
+      <w:r>
+        <w:t xml:space="preserve">) survive in the schema for backwards compatibility with historical rows but are no longer written by the app. They are safe to drop in a future migration once the team is sure no historical data needs them. Likewise the</w:t>
+      </w:r>
+      <w:r>
+        <w:t xml:space="preserve"> </w:t>
+      </w:r>
+      <w:r>
+        <w:rPr>
+          <w:rStyle w:val="VerbatimChar"/>
+        </w:rPr>
+        <w:t xml:space="preserve">EINDREDACTEUR</w:t>
+      </w:r>
+      <w:r>
+        <w:t xml:space="preserve">/</w:t>
+      </w:r>
+      <w:r>
+        <w:rPr>
+          <w:rStyle w:val="VerbatimChar"/>
+        </w:rPr>
+        <w:t xml:space="preserve">PRODUCER</w:t>
+      </w:r>
+      <w:r>
+        <w:t xml:space="preserve"> </w:t>
+      </w:r>
+      <w:r>
+        <w:t xml:space="preserve">and</w:t>
+      </w:r>
+      <w:r>
+        <w:t xml:space="preserve"> </w:t>
+      </w:r>
+      <w:r>
+        <w:rPr>
+          <w:rStyle w:val="VerbatimChar"/>
+        </w:rPr>
+        <w:t xml:space="preserve">COORDINATOR</w:t>
+      </w:r>
+      <w:r>
+        <w:t xml:space="preserve"> </w:t>
+      </w:r>
+      <w:r>
+        <w:t xml:space="preserve">user roles are vestigial; the UI exposes only</w:t>
+      </w:r>
+      <w:r>
+        <w:t xml:space="preserve"> </w:t>
+      </w:r>
+      <w:r>
+        <w:rPr>
+          <w:b/>
+          <w:bCs/>
+        </w:rPr>
+        <w:t xml:space="preserve">Specialist</w:t>
+      </w:r>
+      <w:r>
+        <w:t xml:space="preserve"> </w:t>
+      </w:r>
+      <w:r>
+        <w:t xml:space="preserve">and</w:t>
+      </w:r>
+      <w:r>
+        <w:t xml:space="preserve"> </w:t>
+      </w:r>
+      <w:r>
+        <w:rPr>
+          <w:b/>
+          <w:bCs/>
+        </w:rPr>
+        <w:t xml:space="preserve">Admin</w:t>
+      </w:r>
+      <w:r>
+        <w:t xml:space="preserve">.</w:t>
+      </w:r>
+    </w:p>
     <w:bookmarkStart w:id="9" w:name="conventions"/>
     <w:p>
       <w:pPr>
@@ -2237,13 +2389,37 @@
               <w:rPr>
                 <w:rStyle w:val="VerbatimChar"/>
               </w:rPr>
+              <w:t xml:space="preserve">KLAAR</w:t>
+            </w:r>
+            <w:r>
+              <w:t xml:space="preserve"> </w:t>
+            </w:r>
+            <w:r>
+              <w:t xml:space="preserve">(the</w:t>
+            </w:r>
+            <w:r>
+              <w:t xml:space="preserve"> </w:t>
+            </w:r>
+            <w:r>
+              <w:rPr>
+                <w:rStyle w:val="VerbatimChar"/>
+              </w:rPr>
               <w:t xml:space="preserve">EERSTE_BEOORDELING</w:t>
             </w:r>
             <w:r>
+              <w:t xml:space="preserve">,</w:t>
+            </w:r>
+            <w:r>
               <w:t xml:space="preserve"> </w:t>
             </w:r>
             <w:r>
-              <w:t xml:space="preserve">/</w:t>
+              <w:rPr>
+                <w:rStyle w:val="VerbatimChar"/>
+              </w:rPr>
+              <w:t xml:space="preserve">EINDBEOORDELING</w:t>
+            </w:r>
+            <w:r>
+              <w:t xml:space="preserve">,</w:t>
             </w:r>
             <w:r>
               <w:t xml:space="preserve"> </w:t>
@@ -2252,37 +2428,13 @@
               <w:rPr>
                 <w:rStyle w:val="VerbatimChar"/>
               </w:rPr>
-              <w:t xml:space="preserve">EINDBEOORDELING</w:t>
+              <w:t xml:space="preserve">AFGEKEURD</w:t>
             </w:r>
             <w:r>
               <w:t xml:space="preserve"> </w:t>
             </w:r>
             <w:r>
-              <w:t xml:space="preserve">/</w:t>
-            </w:r>
-            <w:r>
-              <w:t xml:space="preserve"> </w:t>
-            </w:r>
-            <w:r>
-              <w:rPr>
-                <w:rStyle w:val="VerbatimChar"/>
-              </w:rPr>
-              <w:t xml:space="preserve">AFGEKEURD</w:t>
-            </w:r>
-            <w:r>
-              <w:t xml:space="preserve"> </w:t>
-            </w:r>
-            <w:r>
-              <w:t xml:space="preserve">/</w:t>
-            </w:r>
-            <w:r>
-              <w:t xml:space="preserve"> </w:t>
-            </w:r>
-            <w:r>
-              <w:rPr>
-                <w:rStyle w:val="VerbatimChar"/>
-              </w:rPr>
-              <w:t xml:space="preserve">KLAAR</w:t>
+              <w:t xml:space="preserve">values exist in older rows but are no longer written)</w:t>
             </w:r>
           </w:p>
         </w:tc>
@@ -2482,6 +2634,79 @@
               <w:rPr>
                 <w:rStyle w:val="VerbatimChar"/>
               </w:rPr>
+              <w:t xml:space="preserve">approved_by</w:t>
+            </w:r>
+          </w:p>
+        </w:tc>
+        <w:tc>
+          <w:tcPr/>
+          <w:p>
+            <w:pPr>
+              <w:pStyle w:val="Compact"/>
+            </w:pPr>
+            <w:r>
+              <w:t xml:space="preserve">UUID FK</w:t>
+            </w:r>
+          </w:p>
+        </w:tc>
+        <w:tc>
+          <w:tcPr/>
+          <w:p>
+            <w:pPr>
+              <w:pStyle w:val="Compact"/>
+            </w:pPr>
+            <w:r>
+              <w:t xml:space="preserve">who marked the document Klaar</w:t>
+            </w:r>
+          </w:p>
+        </w:tc>
+      </w:tr>
+      <w:tr>
+        <w:tc>
+          <w:tcPr/>
+          <w:p>
+            <w:pPr>
+              <w:pStyle w:val="Compact"/>
+            </w:pPr>
+            <w:r>
+              <w:rPr>
+                <w:rStyle w:val="VerbatimChar"/>
+              </w:rPr>
+              <w:t xml:space="preserve">approved_at</w:t>
+            </w:r>
+          </w:p>
+        </w:tc>
+        <w:tc>
+          <w:tcPr/>
+          <w:p>
+            <w:pPr>
+              <w:pStyle w:val="Compact"/>
+            </w:pPr>
+            <w:r>
+              <w:t xml:space="preserve">timestamptz</w:t>
+            </w:r>
+          </w:p>
+        </w:tc>
+        <w:tc>
+          <w:tcPr/>
+          <w:p>
+            <w:pPr>
+              <w:pStyle w:val="Compact"/>
+            </w:pPr>
+          </w:p>
+        </w:tc>
+      </w:tr>
+      <w:tr>
+        <w:tc>
+          <w:tcPr/>
+          <w:p>
+            <w:pPr>
+              <w:pStyle w:val="Compact"/>
+            </w:pPr>
+            <w:r>
+              <w:rPr>
+                <w:rStyle w:val="VerbatimChar"/>
+              </w:rPr>
               <w:t xml:space="preserve">rejection_category</w:t>
             </w:r>
           </w:p>
@@ -2504,16 +2729,7 @@
               <w:pStyle w:val="Compact"/>
             </w:pPr>
             <w:r>
-              <w:t xml:space="preserve">filled when status =</w:t>
-            </w:r>
-            <w:r>
-              <w:t xml:space="preserve"> </w:t>
-            </w:r>
-            <w:r>
-              <w:rPr>
-                <w:rStyle w:val="VerbatimChar"/>
-              </w:rPr>
-              <w:t xml:space="preserve">AFGEKEURD</w:t>
+              <w:t xml:space="preserve">vestigial — old review flow, no longer written</w:t>
             </w:r>
           </w:p>
         </w:tc>
@@ -2550,6 +2766,9 @@
             <w:pPr>
               <w:pStyle w:val="Compact"/>
             </w:pPr>
+            <w:r>
+              <w:t xml:space="preserve">vestigial</w:t>
+            </w:r>
           </w:p>
         </w:tc>
       </w:tr>
@@ -2585,6 +2804,9 @@
             <w:pPr>
               <w:pStyle w:val="Compact"/>
             </w:pPr>
+            <w:r>
+              <w:t xml:space="preserve">vestigial</w:t>
+            </w:r>
           </w:p>
         </w:tc>
       </w:tr>
@@ -2620,6 +2842,9 @@
             <w:pPr>
               <w:pStyle w:val="Compact"/>
             </w:pPr>
+            <w:r>
+              <w:t xml:space="preserve">vestigial</w:t>
+            </w:r>
           </w:p>
         </w:tc>
       </w:tr>
@@ -2655,6 +2880,9 @@
             <w:pPr>
               <w:pStyle w:val="Compact"/>
             </w:pPr>
+            <w:r>
+              <w:t xml:space="preserve">vestigial</w:t>
+            </w:r>
           </w:p>
         </w:tc>
       </w:tr>
@@ -2690,76 +2918,9 @@
             <w:pPr>
               <w:pStyle w:val="Compact"/>
             </w:pPr>
-          </w:p>
-        </w:tc>
-      </w:tr>
-      <w:tr>
-        <w:tc>
-          <w:tcPr/>
-          <w:p>
-            <w:pPr>
-              <w:pStyle w:val="Compact"/>
-            </w:pPr>
-            <w:r>
-              <w:rPr>
-                <w:rStyle w:val="VerbatimChar"/>
-              </w:rPr>
-              <w:t xml:space="preserve">approved_by</w:t>
-            </w:r>
-          </w:p>
-        </w:tc>
-        <w:tc>
-          <w:tcPr/>
-          <w:p>
-            <w:pPr>
-              <w:pStyle w:val="Compact"/>
-            </w:pPr>
-            <w:r>
-              <w:t xml:space="preserve">UUID FK</w:t>
-            </w:r>
-          </w:p>
-        </w:tc>
-        <w:tc>
-          <w:tcPr/>
-          <w:p>
-            <w:pPr>
-              <w:pStyle w:val="Compact"/>
-            </w:pPr>
-          </w:p>
-        </w:tc>
-      </w:tr>
-      <w:tr>
-        <w:tc>
-          <w:tcPr/>
-          <w:p>
-            <w:pPr>
-              <w:pStyle w:val="Compact"/>
-            </w:pPr>
-            <w:r>
-              <w:rPr>
-                <w:rStyle w:val="VerbatimChar"/>
-              </w:rPr>
-              <w:t xml:space="preserve">approved_at</w:t>
-            </w:r>
-          </w:p>
-        </w:tc>
-        <w:tc>
-          <w:tcPr/>
-          <w:p>
-            <w:pPr>
-              <w:pStyle w:val="Compact"/>
-            </w:pPr>
-            <w:r>
-              <w:t xml:space="preserve">timestamptz</w:t>
-            </w:r>
-          </w:p>
-        </w:tc>
-        <w:tc>
-          <w:tcPr/>
-          <w:p>
-            <w:pPr>
-              <w:pStyle w:val="Compact"/>
-            </w:pPr>
+            <w:r>
+              <w:t xml:space="preserve">vestigial</w:t>
+            </w:r>
           </w:p>
         </w:tc>
       </w:tr>

</xml_diff>